<commit_message>
Realized the 1st step
</commit_message>
<xml_diff>
--- a/Что было сделано в модуле 1.docx
+++ b/Что было сделано в модуле 1.docx
@@ -3,11 +3,22 @@
 <w:document xmlns:wpc="http://schemas.microsoft.com/office/word/2010/wordprocessingCanvas" xmlns:cx="http://schemas.microsoft.com/office/drawing/2014/chartex" xmlns:cx1="http://schemas.microsoft.com/office/drawing/2015/9/8/chartex" xmlns:cx2="http://schemas.microsoft.com/office/drawing/2015/10/21/chartex" xmlns:cx3="http://schemas.microsoft.com/office/drawing/2016/5/9/chartex" xmlns:cx4="http://schemas.microsoft.com/office/drawing/2016/5/10/chartex" xmlns:cx5="http://schemas.microsoft.com/office/drawing/2016/5/11/chartex" xmlns:cx6="http://schemas.microsoft.com/office/drawing/2016/5/12/chartex" xmlns:cx7="http://schemas.microsoft.com/office/drawing/2016/5/13/chartex" xmlns:cx8="http://schemas.microsoft.com/office/drawing/2016/5/14/chartex" xmlns:mc="http://schemas.openxmlformats.org/markup-compatibility/2006" xmlns:aink="http://schemas.microsoft.com/office/drawing/2016/ink" xmlns:am3d="http://schemas.microsoft.com/office/drawing/2017/model3d" xmlns:o="urn:schemas-microsoft-com:office:office" xmlns:r="http://schemas.openxmlformats.org/officeDocument/2006/relationships" xmlns:m="http://schemas.openxmlformats.org/officeDocument/2006/math" xmlns:v="urn:schemas-microsoft-com:vml" xmlns:wp14="http://schemas.microsoft.com/office/word/2010/wordprocessingDrawing" xmlns:wp="http://schemas.openxmlformats.org/drawingml/2006/wordprocessingDrawing" xmlns:w10="urn:schemas-microsoft-com:office:word" xmlns:w="http://schemas.openxmlformats.org/wordprocessingml/2006/main" xmlns:w14="http://schemas.microsoft.com/office/word/2010/wordml" xmlns:w15="http://schemas.microsoft.com/office/word/2012/wordml" xmlns:w16cex="http://schemas.microsoft.com/office/word/2018/wordml/cex" xmlns:w16cid="http://schemas.microsoft.com/office/word/2016/wordml/cid" xmlns:w16="http://schemas.microsoft.com/office/word/2018/wordml" xmlns:w16se="http://schemas.microsoft.com/office/word/2015/wordml/symex" xmlns:wpg="http://schemas.microsoft.com/office/word/2010/wordprocessingGroup" xmlns:wpi="http://schemas.microsoft.com/office/word/2010/wordprocessingInk" xmlns:wne="http://schemas.microsoft.com/office/word/2006/wordml" xmlns:wps="http://schemas.microsoft.com/office/word/2010/wordprocessingShape" mc:Ignorable="w14 w15 w16se w16cid w16 w16cex wp14">
   <w:body>
     <w:p>
+      <w:pPr>
+        <w:rPr>
+          <w:lang w:val="en-US"/>
+        </w:rPr>
+      </w:pPr>
+      <w:r>
+        <w:t>В модуле 1 было сделано:</w:t>
+      </w:r>
+      <w:r>
+        <w:rPr>
+          <w:lang w:val="en-US"/>
+        </w:rPr>
+        <w:t xml:space="preserve">     </w:t>
+      </w:r>
       <w:bookmarkStart w:id="0" w:name="_GoBack"/>
       <w:bookmarkEnd w:id="0"/>
-      <w:r>
-        <w:t>В модуле 1 было сделано:</w:t>
-      </w:r>
     </w:p>
     <w:p>
       <w:r>
@@ -199,15 +210,7 @@
     </w:p>
     <w:p>
       <w:r>
-        <w:t xml:space="preserve">Из примечательного </w:t>
-      </w:r>
-      <w:proofErr w:type="gramStart"/>
-      <w:r>
-        <w:t>тут  -</w:t>
-      </w:r>
-      <w:proofErr w:type="gramEnd"/>
-      <w:r>
-        <w:t xml:space="preserve"> атрибут </w:t>
+        <w:t xml:space="preserve">Из примечательного тут  - атрибут </w:t>
       </w:r>
       <w:r>
         <w:rPr>
@@ -218,39 +221,33 @@
       <w:r>
         <w:t xml:space="preserve">. Он нужен для того, чтобы привязать к </w:t>
       </w:r>
-      <w:proofErr w:type="spellStart"/>
       <w:r>
         <w:rPr>
           <w:lang w:val="en-US"/>
         </w:rPr>
         <w:t>ListView</w:t>
       </w:r>
-      <w:proofErr w:type="spellEnd"/>
       <w:r>
         <w:t xml:space="preserve"> </w:t>
       </w:r>
       <w:r>
         <w:t xml:space="preserve">данные из файла </w:t>
       </w:r>
-      <w:proofErr w:type="spellStart"/>
       <w:r>
         <w:rPr>
           <w:lang w:val="en-US"/>
         </w:rPr>
         <w:t>MainActivity</w:t>
       </w:r>
-      <w:proofErr w:type="spellEnd"/>
       <w:r>
         <w:t>.</w:t>
       </w:r>
-      <w:proofErr w:type="spellStart"/>
       <w:r>
         <w:rPr>
           <w:lang w:val="en-US"/>
         </w:rPr>
         <w:t>kt</w:t>
       </w:r>
-      <w:proofErr w:type="spellEnd"/>
       <w:r>
         <w:br/>
       </w:r>
@@ -273,24 +270,17 @@
         <w:t>HTML</w:t>
       </w:r>
       <w:r>
-        <w:t xml:space="preserve">), а файлы с таким же названием, но с </w:t>
-      </w:r>
-      <w:proofErr w:type="gramStart"/>
-      <w:r>
-        <w:t xml:space="preserve">расширением </w:t>
+        <w:t xml:space="preserve">), а файлы с таким же названием, но с расширением </w:t>
       </w:r>
       <w:r>
         <w:t>.</w:t>
       </w:r>
-      <w:proofErr w:type="spellStart"/>
       <w:r>
         <w:rPr>
           <w:lang w:val="en-US"/>
         </w:rPr>
         <w:t>kt</w:t>
       </w:r>
-      <w:proofErr w:type="spellEnd"/>
-      <w:proofErr w:type="gramEnd"/>
       <w:r>
         <w:t xml:space="preserve"> </w:t>
       </w:r>
@@ -319,7 +309,6 @@
         <w:lastRenderedPageBreak/>
         <w:t xml:space="preserve">Написал класс </w:t>
       </w:r>
-      <w:proofErr w:type="spellStart"/>
       <w:r>
         <w:rPr>
           <w:b/>
@@ -328,7 +317,6 @@
         </w:rPr>
         <w:t>MainActivity</w:t>
       </w:r>
-      <w:proofErr w:type="spellEnd"/>
       <w:r>
         <w:rPr>
           <w:b/>
@@ -336,7 +324,6 @@
         </w:rPr>
         <w:t>.</w:t>
       </w:r>
-      <w:proofErr w:type="spellStart"/>
       <w:r>
         <w:rPr>
           <w:b/>
@@ -345,7 +332,6 @@
         </w:rPr>
         <w:t>kt</w:t>
       </w:r>
-      <w:proofErr w:type="spellEnd"/>
     </w:p>
     <w:p>
       <w:r>
@@ -511,14 +497,12 @@
       <w:r>
         <w:t xml:space="preserve">Поправил </w:t>
       </w:r>
-      <w:proofErr w:type="spellStart"/>
       <w:r>
         <w:rPr>
           <w:lang w:val="en-US"/>
         </w:rPr>
         <w:t>AndroidManifest</w:t>
       </w:r>
-      <w:proofErr w:type="spellEnd"/>
       <w:r>
         <w:t>.</w:t>
       </w:r>
@@ -532,13 +516,8 @@
     <w:p>
       <w:r>
         <w:lastRenderedPageBreak/>
-        <w:t xml:space="preserve">Здесь я прописал из каких активностей состоит приложение, какое название, чтобы его можно было найти в </w:t>
-      </w:r>
-      <w:proofErr w:type="spellStart"/>
-      <w:r>
-        <w:t>лаунчере</w:t>
-      </w:r>
-      <w:proofErr w:type="spellEnd"/>
+        <w:t>Здесь я прописал из каких активностей состоит приложение, какое название, чтобы его можно было найти в лаунчере</w:t>
+      </w:r>
     </w:p>
     <w:p>
       <w:r>

</xml_diff>